<commit_message>
feat: add 30-second retries and Wi-Fi radio recovery
</commit_message>
<xml_diff>
--- a/docs/CampusNetGuard开发设计与实现说明.docx
+++ b/docs/CampusNetGuard开发设计与实现说明.docx
@@ -343,7 +343,7 @@
                 <w:rFonts w:ascii="Microsoft YaHei" w:hAnsi="Microsoft YaHei" w:eastAsia="Microsoft YaHei" w:cs="Microsoft YaHei"/>
                 <w:sz w:val="21"/>
               </w:rPr>
-              <w:t>程序采用“轻量后台监控 + 状态机 + 门户认证 + 浏览器回退”的方案：网络正常时几乎不做事；连续检测到断网后才访问校园网门户并尝试认证；认证失败按退避策略等待，避免无限提交；计划断网时段和手动暂停会停止自动操作。</w:t>
+              <w:t>程序采用“轻量后台监控 + 状态机 + 门户认证 + 浏览器回退”的方案：网络正常时几乎不做事；连续检测到断网后才访问校园网门户；普通认证失败每 30 秒持续重试，浏览器回退受独立节流；学校计划断网时段和手动暂停会停止自动操作，但不会主动断开网络。</w:t>
             </w:r>
           </w:p>
         </w:tc>
@@ -678,7 +678,7 @@
                 <w:b w:val="0"/>
                 <w:sz w:val="19"/>
               </w:rPr>
-              <w:t>使用 1、5、15、30 分钟退避，并限制每小时最多 6 次</w:t>
+              <w:t>普通认证失败每 30 秒持续重试，浏览器回退最多每 2 分钟一次</w:t>
             </w:r>
           </w:p>
         </w:tc>
@@ -1039,7 +1039,7 @@
                 <w:b w:val="0"/>
                 <w:sz w:val="19"/>
               </w:rPr>
-              <w:t>启动、单实例、状态机、定时检查、退避和暂停调度</w:t>
+              <w:t>启动、单实例、状态机、30 秒重试和暂停调度</w:t>
             </w:r>
           </w:p>
         </w:tc>
@@ -1519,7 +1519,7 @@
           <w:color w:val="505A69"/>
           <w:sz w:val="18"/>
         </w:rPr>
-        <w:t>图 2  运行状态流程：在线、认证、Wi-Fi 回退、暂停和退避</w:t>
+        <w:t>图 2  运行状态流程：在线、认证、Wi-Fi 回退、暂停和持续重试</w:t>
       </w:r>
     </w:p>
     <w:p>
@@ -1528,7 +1528,7 @@
           <w:rFonts w:ascii="Microsoft YaHei" w:hAnsi="Microsoft YaHei" w:eastAsia="Microsoft YaHei" w:cs="Microsoft YaHei"/>
           <w:sz w:val="21"/>
         </w:rPr>
-        <w:t>状态机大致经历：启动并加载配置，进入在线或等待网络；断网后判断这是否属于计划暂停；若不是，则尝试有线门户认证；有线认证失败且物理断线时进入 Wi-Fi 回退；多次失败进入退避等待。计划暂停、手动暂停、凭据错误和人工处理会阻止自动提交，但不会让程序退出托盘。</w:t>
+        <w:t>状态机大致经历：启动并加载配置，进入在线或等待网络；断网后判断这是否属于学校计划断网时段；若不是，则尝试有线门户认证；普通失败在 30 秒后继续尝试；物理断开时进入 Wi-Fi 回退。计划暂停、手动暂停、凭据错误和人工处理会阻止自动提交，但不会让程序退出托盘。</w:t>
       </w:r>
     </w:p>
     <w:p>
@@ -2049,7 +2049,7 @@
           <w:rFonts w:ascii="Microsoft YaHei" w:hAnsi="Microsoft YaHei" w:eastAsia="Microsoft YaHei" w:cs="Microsoft YaHei"/>
           <w:sz w:val="21"/>
         </w:rPr>
-        <w:t>Wi-Fi 回退只连接 Windows 中已保存的 gdei-WiFi-S，不尝试 gdei-WiFi。为避免在家或其他网络环境误连，程序要求最近有校园网上下文，或附近确实能看到该 SSID。连接并取得 IPv4 后，再探测互联网；如果需要认证，则捕获 Wi-Fi 门户并走同一套认证流程。</w:t>
+        <w:t>Wi-Fi 回退只连接 Windows 中已保存的 gdei-WiFi-S，不尝试 gdei-WiFi。有线持续断开后，程序先检查 WLAN 无线电状态；如果只是 Windows 软件 Wi-Fi 开关关闭，会通过 WLAN API 尝试开启。硬件开关关闭或网卡被设备管理器禁用时，程序不会请求管理员权限强行绕过，而是提示用户。为避免在家或其他网络环境误连，程序还要求最近有校园网上下文，或附近确实能看到该 SSID。</w:t>
       </w:r>
     </w:p>
     <w:tbl>
@@ -2297,7 +2297,7 @@
           <w:rFonts w:ascii="Microsoft YaHei" w:hAnsi="Microsoft YaHei" w:eastAsia="Microsoft YaHei" w:cs="Microsoft YaHei"/>
           <w:sz w:val="21"/>
         </w:rPr>
-        <w:t>如果无线网卡或无线开关本身关闭，程序不会为了强制启用硬件而请求管理员权限，而是通过托盘提示用户手动开启。这样保留了“普通权限即可运行”的设计前提。</w:t>
+        <w:t>如果是 Windows 软件 Wi-Fi 开关关闭，程序会尝试通过 WLAN API 自动开启；如果硬件开关关闭、网卡被设备管理器禁用或系统策略阻止，程序不会请求管理员权限强行绕过，而是通过托盘提示用户手动处理。这样保留了“普通权限即可运行”的设计前提。</w:t>
       </w:r>
     </w:p>
     <w:p>
@@ -2312,7 +2312,7 @@
           <w:color w:val="192C48"/>
           <w:sz w:val="32"/>
         </w:rPr>
-        <w:t>8. 计划暂停、退避与防误判</w:t>
+        <w:t>8. 计划暂停、持续重试与防误判</w:t>
       </w:r>
     </w:p>
     <w:p>
@@ -2569,7 +2569,7 @@
           <w:rFonts w:ascii="Microsoft YaHei" w:hAnsi="Microsoft YaHei" w:eastAsia="Microsoft YaHei" w:cs="Microsoft YaHei"/>
           <w:sz w:val="21"/>
         </w:rPr>
-        <w:t>普通认证失败使用 1、5、15、30、30、30 分钟退避，每小时最多 6 次。认证成功后会清空失败计数；账号或密码明确错误、页面出现可见且可提交的验证码/动态密码字段时，程序停止自动认证，等待用户修改凭据或手动处理。</w:t>
+        <w:t>普通认证失败固定等待 30 秒后继续尝试，不再限制每小时 6 次。浏览器回退最多每 2 分钟启动一次，避免高频启动 Chrome 或 Edge。认证成功后会清空失败计数；账号或密码明确错误、页面出现可见且可提交的验证码或动态密码字段时，程序停止自动认证，等待用户修改凭据或手动处理。</w:t>
       </w:r>
     </w:p>
     <w:p>
@@ -2958,7 +2958,7 @@
           <w:rFonts w:ascii="Microsoft YaHei" w:hAnsi="Microsoft YaHei" w:eastAsia="Microsoft YaHei" w:cs="Microsoft YaHei"/>
           <w:sz w:val="21"/>
         </w:rPr>
-        <w:t>托盘菜单包含：查看状态、自动重连、立即检测、有线恢复策略、账号设置、查看日志、日志保存位置、开机启动和退出。状态窗口集中显示有线连接、Wi-Fi SSID、互联网状态、校园环境判断、计划暂停、最近认证结果、下次重试时间和恢复策略。手动暂停只停止自动操作，程序仍保留在托盘中。</w:t>
+        <w:t>托盘菜单包含：查看状态、自动重连、立即检测、有线恢复策略、账号设置、查看日志、日志保存位置、有线断开时尝试开启 Wi-Fi、开机启动和退出。状态窗口集中显示有线连接、Wi-Fi SSID、互联网状态、校园环境判断、计划暂停、自动开启 Wi-Fi 设置、最近认证结果、下次重试时间和恢复策略。手动暂停只停止自动操作，程序仍保留在托盘中。</w:t>
       </w:r>
     </w:p>
     <w:p>
@@ -3304,7 +3304,7 @@
                 <w:b w:val="0"/>
                 <w:sz w:val="19"/>
               </w:rPr>
-              <w:t>害怕计划断网期间反复重试</w:t>
+              <w:t>害怕学校计划断网期间反复重试</w:t>
             </w:r>
           </w:p>
         </w:tc>
@@ -3330,7 +3330,7 @@
                 <w:b w:val="0"/>
                 <w:sz w:val="19"/>
               </w:rPr>
-              <w:t>周日到周四 01:00–06:00 完全暂停，06:00 恢复并立即检查</w:t>
+              <w:t>周日到周四 01:00–06:00 暂停自动操作，06:00 恢复；不会主动断开网络</w:t>
             </w:r>
           </w:p>
         </w:tc>
@@ -3479,7 +3479,7 @@
           <w:rFonts w:ascii="Microsoft YaHei" w:hAnsi="Microsoft YaHei" w:eastAsia="Microsoft YaHei" w:cs="Microsoft YaHei"/>
           <w:sz w:val="21"/>
         </w:rPr>
-        <w:t>当前离线回归测试结果为 30 PASS、0 FAIL，覆盖计划暂停时间边界、周五周六行为、校园网特征识别、门户表单解析、账号日志脱敏、日志目录修改、单实例、验证码误判、63032 凭据错误、响应解码和失败状态清理等场景。</w:t>
+        <w:t>当前离线回归测试覆盖计划暂停时间边界、周五周六行为、30 秒重试计划、 Wi-Fi 无线电状态策略、网络恢复日志语义、校园网特征识别、门户表单解析、账号日志脱敏、日志目录修改、单实例、验证码误判、63032 凭据错误、响应解码和失败状态清理等场景。</w:t>
       </w:r>
     </w:p>
     <w:tbl>
@@ -3818,7 +3818,7 @@
                 <w:b w:val="0"/>
                 <w:sz w:val="19"/>
               </w:rPr>
-              <w:t>普通故障退避，凭据错误和人工验证要求停止自动提交</w:t>
+              <w:t>普通故障每 30 秒重试，凭据错误和人工验证要求停止自动提交</w:t>
             </w:r>
           </w:p>
         </w:tc>
@@ -4189,7 +4189,7 @@
                 <w:b w:val="0"/>
                 <w:sz w:val="19"/>
               </w:rPr>
-              <w:t>无线网卡和开关可用，gdei-WiFi-S 已保存为 Windows 无线配置</w:t>
+              <w:t>软件 Wi-Fi 开关可尝试自动开启，硬件开关需可用；gdei-WiFi-S 已保存</w:t>
             </w:r>
           </w:p>
         </w:tc>
@@ -4314,7 +4314,7 @@
           <w:rFonts w:ascii="Microsoft YaHei" w:hAnsi="Microsoft YaHei" w:eastAsia="Microsoft YaHei" w:cs="Microsoft YaHei"/>
           <w:sz w:val="21"/>
         </w:rPr>
-        <w:t>程序的安全策略是“失败停住，不猜测”。如果直接请求失败，先尝试浏览器回退；回退仍失败，则按普通故障退避。如果发现账号密码明显错误、出现人工验证要求，或认证响应无法解释，程序保留状态和日志，不进行高风险连续提交。</w:t>
+        <w:t>程序的安全策略是“高风险错误停住，普通故障持续恢复”。如果直接请求失败，会在节流允许时尝试浏览器回退；回退仍失败则每 30 秒继续。如果发现账号密码明显错误、出现人工验证要求，或认证响应无法解释，程序保留状态和日志，不进行高风险连续提交。</w:t>
       </w:r>
     </w:p>
     <w:p>
@@ -4338,7 +4338,7 @@
           <w:rFonts w:ascii="Microsoft YaHei" w:hAnsi="Microsoft YaHei" w:eastAsia="Microsoft YaHei" w:cs="Microsoft YaHei"/>
           <w:sz w:val="21"/>
         </w:rPr>
-        <w:t>这套程序的设计重点不是把门户页面硬编码成一个脚本，而是把“网络是否真的可用”和“是否值得尝试认证”分开判断，再用状态机协调有线、无线、暂停、退避和用户手动控制。这样既能处理校园网的日常掉线，也能在异常情况下保持可控和可排查。</w:t>
+        <w:t>这套程序的设计重点不是把门户页面硬编码成一个脚本，而是把“网络是否真的可用”和“是否值得尝试认证”分开判断，再用状态机协调有线、无线、暂停、重试节流和用户手动控制。这样既能处理校园网的日常掉线，也能在异常情况下保持可控和可排查。</w:t>
       </w:r>
     </w:p>
     <w:p>
@@ -4377,7 +4377,7 @@
           <w:rFonts w:ascii="Microsoft YaHei" w:hAnsi="Microsoft YaHei" w:eastAsia="Microsoft YaHei" w:cs="Microsoft YaHei"/>
           <w:sz w:val="21"/>
         </w:rPr>
-        <w:t>认证失败：先回退浏览器，仍失败则按 1、5、15、30 分钟等待。</w:t>
+        <w:t>认证失败：普通错误每 30 秒重试；浏览器回退最多每 2 分钟一次。</w:t>
       </w:r>
     </w:p>
     <w:p>
@@ -4390,7 +4390,20 @@
           <w:rFonts w:ascii="Microsoft YaHei" w:hAnsi="Microsoft YaHei" w:eastAsia="Microsoft YaHei" w:cs="Microsoft YaHei"/>
           <w:sz w:val="21"/>
         </w:rPr>
-        <w:t>计划断网：周日到周四 01:00–06:00 暂停，06:00 恢复。</w:t>
+        <w:t>计划暂停：周日到周四 01:00–06:00 仅暂停自动操作，06:00 恢复，不会主动断网。</w:t>
+      </w:r>
+    </w:p>
+    <w:p>
+      <w:pPr>
+        <w:pStyle w:val="ListBullet"/>
+        <w:spacing w:after="60"/>
+      </w:pPr>
+      <w:r>
+        <w:rPr>
+          <w:rFonts w:ascii="Microsoft YaHei" w:hAnsi="Microsoft YaHei" w:eastAsia="Microsoft YaHei" w:cs="Microsoft YaHei"/>
+          <w:sz w:val="21"/>
+        </w:rPr>
+        <w:t>Wi-Fi 回退：软件开关关闭时尝试自动开启，硬件开关关闭时提示用户。</w:t>
       </w:r>
     </w:p>
     <w:p>
@@ -4437,7 +4450,7 @@
           <w:rFonts w:ascii="Microsoft YaHei" w:hAnsi="Microsoft YaHei" w:eastAsia="Microsoft YaHei" w:cs="Microsoft YaHei"/>
           <w:sz w:val="21"/>
         </w:rPr>
-        <w:t>网络正常时几乎无感；掉线时自动尝试认证；认证不确定时回退到浏览器；计划断网和手动暂停期间不误操作；出现明确凭据或人工验证问题时停止自动提交并等待用户处理。</w:t>
+        <w:t>网络正常时几乎无感；掉线后持续重试；认证不确定时节流使用浏览器回退；学校计划断网和手动暂停期间不误操作；出现明确凭据或人工验证问题时停止自动提交并等待用户处理。</w:t>
       </w:r>
     </w:p>
     <w:sectPr>

</xml_diff>

<commit_message>
fix: repair portal responses and browser retry
</commit_message>
<xml_diff>
--- a/docs/CampusNetGuard开发设计与实现说明.docx
+++ b/docs/CampusNetGuard开发设计与实现说明.docx
@@ -678,7 +678,7 @@
                 <w:b w:val="0"/>
                 <w:sz w:val="19"/>
               </w:rPr>
-              <w:t>普通认证失败每 30 秒持续重试，浏览器回退最多每 2 分钟一次</w:t>
+              <w:t>普通认证失败每 30 秒持续重试，浏览器回退同样最多每 30 秒一次</w:t>
             </w:r>
           </w:p>
         </w:tc>
@@ -1846,7 +1846,7 @@
                 <w:b w:val="0"/>
                 <w:sz w:val="19"/>
               </w:rPr>
-              <w:t>先 URL 解码，必要时再 Base64 解码，提取 errorNumber、portalLink、e_c、e_d</w:t>
+              <w:t>先 Base64 解码，再 URL 解码，提取 errorNumber、portalLink、e_c、e_d</w:t>
             </w:r>
           </w:p>
         </w:tc>
@@ -2569,7 +2569,7 @@
           <w:rFonts w:ascii="Microsoft YaHei" w:hAnsi="Microsoft YaHei" w:eastAsia="Microsoft YaHei" w:cs="Microsoft YaHei"/>
           <w:sz w:val="21"/>
         </w:rPr>
-        <w:t>普通认证失败固定等待 30 秒后继续尝试，不再限制每小时 6 次。浏览器回退最多每 2 分钟启动一次，避免高频启动 Chrome 或 Edge。认证成功后会清空失败计数；账号或密码明确错误、页面出现可见且可提交的验证码或动态密码字段时，程序停止自动认证，等待用户修改凭据或手动处理。</w:t>
+        <w:t>普通认证失败固定等待 30 秒后继续尝试，不再限制每小时 6 次。浏览器回退同样最多每 30 秒启动一次，并且每轮认证最多启动一次。认证成功后会清空失败计数；账号或密码明确错误、页面出现可见且可提交的验证码或动态密码字段时，程序停止自动认证，等待用户修改凭据或手动处理。</w:t>
       </w:r>
     </w:p>
     <w:p>
@@ -2578,7 +2578,7 @@
           <w:rFonts w:ascii="Microsoft YaHei" w:hAnsi="Microsoft YaHei" w:eastAsia="Microsoft YaHei" w:cs="Microsoft YaHei"/>
           <w:sz w:val="21"/>
         </w:rPr>
-        <w:t>开发中特别避免了两类误判：第一，不把页面中隐藏的中文模板文字当成人机验证；第二，不把一次“门户页面为空或未返回登录表单”直接当成最终失败。当前逻辑会在异常后重新探测互联网，如果网络已恢复，则记录恢复并按成功处理。因此，日志中出现一条 WARN 不一定代表最终仍然断网。</w:t>
+        <w:t>开发中特别避免了两类误判：第一，不把页面中隐藏的中文模板文字当成人机验证；第二，不把一次“门户页面为空或未返回登录表单”直接当成最终失败。程序按门户脚本要求先执行 Base64 解码，再执行 URL 解码；响应无法解析、缺少认证结果或没有返回内容时，会尝试浏览器回退。网络恢复后仍以互联网探测结果确认。因此，日志中出现一条 WARN 不一定代表最终仍然断网。程序还会记录正常退出和未处理异常，便于区分主动关闭与代码错误。</w:t>
       </w:r>
     </w:p>
     <w:p>
@@ -4377,7 +4377,7 @@
           <w:rFonts w:ascii="Microsoft YaHei" w:hAnsi="Microsoft YaHei" w:eastAsia="Microsoft YaHei" w:cs="Microsoft YaHei"/>
           <w:sz w:val="21"/>
         </w:rPr>
-        <w:t>认证失败：普通错误每 30 秒重试；浏览器回退最多每 2 分钟一次。</w:t>
+        <w:t>认证失败：普通错误每 30 秒重试；浏览器回退同样最多每 30 秒一次。</w:t>
       </w:r>
     </w:p>
     <w:p>

</xml_diff>